<commit_message>
Gutschrift-Vorlage: Anrede an die anderen drei angeglichen
"Sehr geehrte(r) {{kunde_anrede}} {{kunde_nachname}}," wird zu
"Hallo {{kunde_anrede}} {{kunde_nachname}}," - wie in Rechnung, Angebot und
Mahnung. Das "(r)" war ohnehin ueberfluessig, weil {{kunde_anrede}} bereits
"Herr" oder "Frau" liefert.

Co-Authored-By: Claude Opus 5 <noreply@anthropic.com>
</commit_message>
<xml_diff>
--- a/vorlagen/vorlage_gutschrift.docx
+++ b/vorlagen/vorlage_gutschrift.docx
@@ -342,48 +342,12 @@
           <w:szCs w:val="20"/>
           <w:lang w:val="de-DE"/>
         </w:rPr>
-        <w:t>Sehr geehrte(r) {{</w:t>
+        <w:t>Hallo {{kunde_anrede}} {{kunde_nachname}},</w:t>
       </w:r>
       <w:proofErr w:type="spellStart"/>
-      <w:r>
-        <w:rPr>
-          <w:color w:val="auto"/>
-          <w:sz w:val="20"/>
-          <w:szCs w:val="20"/>
-          <w:lang w:val="de-DE"/>
-        </w:rPr>
-        <w:t>kunde_anrede</w:t>
-      </w:r>
       <w:proofErr w:type="spellEnd"/>
-      <w:r>
-        <w:rPr>
-          <w:color w:val="auto"/>
-          <w:sz w:val="20"/>
-          <w:szCs w:val="20"/>
-          <w:lang w:val="de-DE"/>
-        </w:rPr>
-        <w:t>}} {{</w:t>
-      </w:r>
       <w:proofErr w:type="spellStart"/>
-      <w:r>
-        <w:rPr>
-          <w:color w:val="auto"/>
-          <w:sz w:val="20"/>
-          <w:szCs w:val="20"/>
-          <w:lang w:val="de-DE"/>
-        </w:rPr>
-        <w:t>kunde_nachname</w:t>
-      </w:r>
       <w:proofErr w:type="spellEnd"/>
-      <w:r>
-        <w:rPr>
-          <w:color w:val="auto"/>
-          <w:sz w:val="20"/>
-          <w:szCs w:val="20"/>
-          <w:lang w:val="de-DE"/>
-        </w:rPr>
-        <w:t>}},</w:t>
-      </w:r>
     </w:p>
     <w:p>
       <w:pPr>

</xml_diff>